<commit_message>
Replace the lab document with a generic community-garden agenda; re-run lab and rewrite affected chapters
</commit_message>
<xml_diff>
--- a/examples/agenda.docx
+++ b/examples/agenda.docx
@@ -7,13 +7,13 @@
         <w:pStyle w:val="Title"/>
       </w:pPr>
       <w:r>
-        <w:t xml:space="preserve">Fall</w:t>
-      </w:r>
-      <w:r>
-        <w:t xml:space="preserve"> </w:t>
-      </w:r>
-      <w:r>
-        <w:t xml:space="preserve">Conference</w:t>
+        <w:t xml:space="preserve">Spring</w:t>
+      </w:r>
+      <w:r>
+        <w:t xml:space="preserve"> </w:t>
+      </w:r>
+      <w:r>
+        <w:t xml:space="preserve">Planting</w:t>
       </w:r>
       <w:r>
         <w:t xml:space="preserve"> </w:t>
@@ -33,13 +33,13 @@
         <w:pStyle w:val="Author"/>
       </w:pPr>
       <w:r>
-        <w:t xml:space="preserve">Convention</w:t>
-      </w:r>
-      <w:r>
-        <w:t xml:space="preserve"> </w:t>
-      </w:r>
-      <w:r>
-        <w:t xml:space="preserve">Committee</w:t>
+        <w:t xml:space="preserve">Rosa</w:t>
+      </w:r>
+      <w:r>
+        <w:t xml:space="preserve"> </w:t>
+      </w:r>
+      <w:r>
+        <w:t xml:space="preserve">Jimenez</w:t>
       </w:r>
     </w:p>
     <w:p>
@@ -47,13 +47,13 @@
         <w:pStyle w:val="Date"/>
       </w:pPr>
       <w:r>
-        <w:t xml:space="preserve">October</w:t>
-      </w:r>
-      <w:r>
-        <w:t xml:space="preserve"> </w:t>
-      </w:r>
-      <w:r>
-        <w:t xml:space="preserve">12,</w:t>
+        <w:t xml:space="preserve">March</w:t>
+      </w:r>
+      <w:r>
+        <w:t xml:space="preserve"> </w:t>
+      </w:r>
+      <w:r>
+        <w:t xml:space="preserve">8,</w:t>
       </w:r>
       <w:r>
         <w:t xml:space="preserve"> </w:t>
@@ -76,13 +76,13 @@
         <w:pStyle w:val="FirstParagraph"/>
       </w:pPr>
       <w:r>
-        <w:t xml:space="preserve">The committee meets to assign the remaining</w:t>
-      </w:r>
-      <w:r>
-        <w:t xml:space="preserve"> </w:t>
-      </w:r>
-      <w:r>
-        <w:t xml:space="preserve">tasks for the Fall Conference. Bring your</w:t>
+        <w:t xml:space="preserve">The club meets to assign the remaining</w:t>
+      </w:r>
+      <w:r>
+        <w:t xml:space="preserve"> </w:t>
+      </w:r>
+      <w:r>
+        <w:t xml:space="preserve">tasks for the spring planting. Bring your</w:t>
       </w:r>
       <w:r>
         <w:t xml:space="preserve"> </w:t>
@@ -94,7 +94,7 @@
         <w:t xml:space="preserve"> </w:t>
       </w:r>
       <w:r>
-        <w:t xml:space="preserve">rooms, and who owns what.</w:t>
+        <w:t xml:space="preserve">beds, and who owns what.</w:t>
       </w:r>
     </w:p>
     <w:bookmarkStart w:id="20" w:name="schedule"/>
@@ -218,7 +218,7 @@
               <w:jc w:val="left"/>
             </w:pPr>
             <w:r>
-              <w:t xml:space="preserve">Registration desk staffing</w:t>
+              <w:t xml:space="preserve">Plot assignment sign-ups</w:t>
             </w:r>
           </w:p>
         </w:tc>
@@ -256,7 +256,7 @@
               <w:jc w:val="left"/>
             </w:pPr>
             <w:r>
-              <w:t xml:space="preserve">Banquet headcount deadline</w:t>
+              <w:t xml:space="preserve">Compost delivery deadline</w:t>
             </w:r>
           </w:p>
         </w:tc>
@@ -294,7 +294,7 @@
               <w:jc w:val="left"/>
             </w:pPr>
             <w:r>
-              <w:t xml:space="preserve">Room setup and signage walk-through</w:t>
+              <w:t xml:space="preserve">Tool shed inventory and sign check</w:t>
             </w:r>
           </w:p>
         </w:tc>
@@ -306,7 +306,7 @@
               <w:jc w:val="left"/>
             </w:pPr>
             <w:r>
-              <w:t xml:space="preserve">Sergeant-at-Arms</w:t>
+              <w:t xml:space="preserve">Coordinator</w:t>
             </w:r>
           </w:p>
         </w:tc>
@@ -331,7 +331,7 @@
         <w:pStyle w:val="Compact"/>
       </w:pPr>
       <w:r>
-        <w:t xml:space="preserve">Confirm the banquet count with the hotel</w:t>
+        <w:t xml:space="preserve">Confirm the compost order with the supplier</w:t>
       </w:r>
       <w:r>
         <w:t xml:space="preserve"> </w:t>
@@ -362,7 +362,7 @@
         <w:pStyle w:val="Compact"/>
       </w:pPr>
       <w:r>
-        <w:t xml:space="preserve">Print the registration list in</w:t>
+        <w:t xml:space="preserve">Print the plot map in</w:t>
       </w:r>
       <w:r>
         <w:t xml:space="preserve"> </w:t>
@@ -378,7 +378,7 @@
         <w:t xml:space="preserve"> </w:t>
       </w:r>
       <w:r>
-        <w:t xml:space="preserve">sizes: the desk copy and the door copy.</w:t>
+        <w:t xml:space="preserve">sizes: the shed copy and the gate copy.</w:t>
       </w:r>
     </w:p>
     <w:p>
@@ -390,7 +390,13 @@
         <w:pStyle w:val="Compact"/>
       </w:pPr>
       <w:r>
-        <w:t xml:space="preserve">Check the projector in the main hall.</w:t>
+        <w:t xml:space="preserve">Check the projector for the seed-starting</w:t>
+      </w:r>
+      <w:r>
+        <w:t xml:space="preserve"> </w:t>
+      </w:r>
+      <w:r>
+        <w:t xml:space="preserve">slideshow.</w:t>
       </w:r>
     </w:p>
     <w:bookmarkEnd w:id="21"/>
@@ -412,13 +418,13 @@
         <w:pStyle w:val="Compact"/>
       </w:pPr>
       <w:r>
-        <w:t xml:space="preserve">Whether the Saturday social hour needs a</w:t>
-      </w:r>
-      <w:r>
-        <w:t xml:space="preserve"> </w:t>
-      </w:r>
-      <w:r>
-        <w:t xml:space="preserve">second bartender.</w:t>
+        <w:t xml:space="preserve">Whether the Saturday work day needs a</w:t>
+      </w:r>
+      <w:r>
+        <w:t xml:space="preserve"> </w:t>
+      </w:r>
+      <w:r>
+        <w:t xml:space="preserve">second wheelbarrow.</w:t>
       </w:r>
     </w:p>
     <w:p>
@@ -430,13 +436,13 @@
         <w:pStyle w:val="Compact"/>
       </w:pPr>
       <w:r>
-        <w:t xml:space="preserve">Who carries the banner in the opening</w:t>
-      </w:r>
-      <w:r>
-        <w:t xml:space="preserve"> </w:t>
-      </w:r>
-      <w:r>
-        <w:t xml:space="preserve">procession.</w:t>
+        <w:t xml:space="preserve">Who carries the seed trays in for the</w:t>
+      </w:r>
+      <w:r>
+        <w:t xml:space="preserve"> </w:t>
+      </w:r>
+      <w:r>
+        <w:t xml:space="preserve">spring sale.</w:t>
       </w:r>
       <w:r>
         <w:rPr>
@@ -450,7 +456,7 @@
         <w:pStyle w:val="FirstParagraph"/>
       </w:pPr>
       <w:r>
-        <w:t xml:space="preserve">Details, past minutes, and the venue map are</w:t>
+        <w:t xml:space="preserve">Details, past minutes, and the plot map are</w:t>
       </w:r>
       <w:r>
         <w:t xml:space="preserve"> </w:t>
@@ -466,7 +472,7 @@
           <w:rPr>
             <w:rStyle w:val="Hyperlink"/>
           </w:rPr>
-          <w:t xml:space="preserve">conference page</w:t>
+          <w:t xml:space="preserve">club page</w:t>
         </w:r>
       </w:hyperlink>
       <w:r>
@@ -482,7 +488,7 @@
           <wp:inline>
             <wp:extent cx="2032000" cy="1270000"/>
             <wp:effectExtent b="0" l="0" r="0" t="0"/>
-            <wp:docPr descr="Attendance at the last three conferences" title="" id="25" name="Picture"/>
+            <wp:docPr descr="Visitors at the last three open days" title="" id="25" name="Picture"/>
             <a:graphic>
               <a:graphicData uri="http://schemas.openxmlformats.org/drawingml/2006/picture">
                 <pic:pic>
@@ -525,7 +531,7 @@
         <w:pStyle w:val="ImageCaption"/>
       </w:pPr>
       <w:r>
-        <w:t xml:space="preserve">Attendance at the last three conferences</w:t>
+        <w:t xml:space="preserve">Visitors at the last three open days</w:t>
       </w:r>
     </w:p>
     <w:bookmarkEnd w:id="27"/>
@@ -570,19 +576,19 @@
         <w:t xml:space="preserve"> </w:t>
       </w:r>
       <w:r>
-        <w:t xml:space="preserve">Last year two people carried it,</w:t>
-      </w:r>
-      <w:r>
-        <w:t xml:space="preserve"> </w:t>
-      </w:r>
-      <w:r>
-        <w:t xml:space="preserve">and the doorway still won. One carrier, and</w:t>
-      </w:r>
-      <w:r>
-        <w:t xml:space="preserve"> </w:t>
-      </w:r>
-      <w:r>
-        <w:t xml:space="preserve">walk slowly.</w:t>
+        <w:t xml:space="preserve">Last year two people carried the</w:t>
+      </w:r>
+      <w:r>
+        <w:t xml:space="preserve"> </w:t>
+      </w:r>
+      <w:r>
+        <w:t xml:space="preserve">big tray, and the gate still won. One</w:t>
+      </w:r>
+      <w:r>
+        <w:t xml:space="preserve"> </w:t>
+      </w:r>
+      <w:r>
+        <w:t xml:space="preserve">carrier, and walk slowly.</w:t>
       </w:r>
     </w:p>
   </w:footnote>

</xml_diff>